<commit_message>
Shared scorer and the comparison section of the report
</commit_message>
<xml_diff>
--- a/Lindani_Model/REPORT_DRAFT.docx
+++ b/Lindani_Model/REPORT_DRAFT.docx
@@ -3548,12 +3548,626 @@
         <w:pStyle w:val="Heading2"/>
       </w:pPr>
       <w:r>
-        <w:t>4.5 Comparison with the pretrained models [PENDING]</w:t>
+        <w:t>4.5 Comparison with the pretrained models</w:t>
       </w:r>
     </w:p>
     <w:p>
       <w:r>
-        <w:t>Insert the three-model table once the other members' figures are available: accuracy, macro F1, parameter count, training time and inference cost.</w:t>
+        <w:t xml:space="preserve">Figures below for the other two models were read from their committed files on the group repository on 28 October 2026. </w:t>
+      </w:r>
+      <w:r>
+        <w:rPr>
+          <w:b/>
+        </w:rPr>
+        <w:t>[CONFIRM each figure with its owner before submission, and ask JP for his parameter count and training time, which are not in his committed files.]</w:t>
+      </w:r>
+    </w:p>
+    <w:tbl>
+      <w:tblPr>
+        <w:tblStyle w:val="LightGrid-Accent1"/>
+        <w:tblW w:type="auto" w:w="0"/>
+        <w:tblLook w:firstColumn="1" w:firstRow="1" w:lastColumn="0" w:lastRow="0" w:noHBand="0" w:noVBand="1" w:val="04A0"/>
+      </w:tblPr>
+      <w:tblGrid>
+        <w:gridCol w:w="1234"/>
+        <w:gridCol w:w="1234"/>
+        <w:gridCol w:w="1234"/>
+        <w:gridCol w:w="1234"/>
+        <w:gridCol w:w="1234"/>
+        <w:gridCol w:w="1234"/>
+        <w:gridCol w:w="1234"/>
+      </w:tblGrid>
+      <w:tr>
+        <w:tc>
+          <w:tcPr>
+            <w:tcW w:type="dxa" w:w="1234"/>
+          </w:tcPr>
+          <w:p>
+            <w:r>
+              <w:rPr>
+                <w:b/>
+              </w:rPr>
+            </w:r>
+            <w:r>
+              <w:rPr>
+                <w:b/>
+              </w:rPr>
+              <w:t>Model</w:t>
+            </w:r>
+          </w:p>
+        </w:tc>
+        <w:tc>
+          <w:tcPr>
+            <w:tcW w:type="dxa" w:w="1234"/>
+          </w:tcPr>
+          <w:p>
+            <w:r>
+              <w:rPr>
+                <w:b/>
+              </w:rPr>
+            </w:r>
+            <w:r>
+              <w:rPr>
+                <w:b/>
+              </w:rPr>
+              <w:t>Weights</w:t>
+            </w:r>
+          </w:p>
+        </w:tc>
+        <w:tc>
+          <w:tcPr>
+            <w:tcW w:type="dxa" w:w="1234"/>
+          </w:tcPr>
+          <w:p>
+            <w:r>
+              <w:rPr>
+                <w:b/>
+              </w:rPr>
+            </w:r>
+            <w:r>
+              <w:rPr>
+                <w:b/>
+              </w:rPr>
+              <w:t>Parameters</w:t>
+            </w:r>
+          </w:p>
+        </w:tc>
+        <w:tc>
+          <w:tcPr>
+            <w:tcW w:type="dxa" w:w="1234"/>
+          </w:tcPr>
+          <w:p>
+            <w:r>
+              <w:rPr>
+                <w:b/>
+              </w:rPr>
+            </w:r>
+            <w:r>
+              <w:rPr>
+                <w:b/>
+              </w:rPr>
+              <w:t>Test accuracy</w:t>
+            </w:r>
+          </w:p>
+        </w:tc>
+        <w:tc>
+          <w:tcPr>
+            <w:tcW w:type="dxa" w:w="1234"/>
+          </w:tcPr>
+          <w:p>
+            <w:r>
+              <w:rPr>
+                <w:b/>
+              </w:rPr>
+            </w:r>
+            <w:r>
+              <w:rPr>
+                <w:b/>
+              </w:rPr>
+              <w:t>Top-5</w:t>
+            </w:r>
+          </w:p>
+        </w:tc>
+        <w:tc>
+          <w:tcPr>
+            <w:tcW w:type="dxa" w:w="1234"/>
+          </w:tcPr>
+          <w:p>
+            <w:r>
+              <w:rPr>
+                <w:b/>
+              </w:rPr>
+            </w:r>
+            <w:r>
+              <w:rPr>
+                <w:b/>
+              </w:rPr>
+              <w:t>Macro F1</w:t>
+            </w:r>
+          </w:p>
+        </w:tc>
+        <w:tc>
+          <w:tcPr>
+            <w:tcW w:type="dxa" w:w="1234"/>
+          </w:tcPr>
+          <w:p>
+            <w:r>
+              <w:rPr>
+                <w:b/>
+              </w:rPr>
+            </w:r>
+            <w:r>
+              <w:rPr>
+                <w:b/>
+              </w:rPr>
+              <w:t>Training</w:t>
+            </w:r>
+          </w:p>
+        </w:tc>
+      </w:tr>
+      <w:tr>
+        <w:tc>
+          <w:tcPr>
+            <w:tcW w:type="dxa" w:w="1234"/>
+          </w:tcPr>
+          <w:p>
+            <w:r/>
+            <w:r>
+              <w:t>Baseline CNN (this work)</w:t>
+            </w:r>
+          </w:p>
+        </w:tc>
+        <w:tc>
+          <w:tcPr>
+            <w:tcW w:type="dxa" w:w="1234"/>
+          </w:tcPr>
+          <w:p>
+            <w:r/>
+            <w:r>
+              <w:t>None, from scratch</w:t>
+            </w:r>
+          </w:p>
+        </w:tc>
+        <w:tc>
+          <w:tcPr>
+            <w:tcW w:type="dxa" w:w="1234"/>
+          </w:tcPr>
+          <w:p>
+            <w:r/>
+            <w:r>
+              <w:t>4,581,784</w:t>
+            </w:r>
+          </w:p>
+        </w:tc>
+        <w:tc>
+          <w:tcPr>
+            <w:tcW w:type="dxa" w:w="1234"/>
+          </w:tcPr>
+          <w:p>
+            <w:r/>
+            <w:r>
+              <w:t>53.84 %</w:t>
+            </w:r>
+          </w:p>
+        </w:tc>
+        <w:tc>
+          <w:tcPr>
+            <w:tcW w:type="dxa" w:w="1234"/>
+          </w:tcPr>
+          <w:p>
+            <w:r/>
+            <w:r>
+              <w:t>84.78 %</w:t>
+            </w:r>
+          </w:p>
+        </w:tc>
+        <w:tc>
+          <w:tcPr>
+            <w:tcW w:type="dxa" w:w="1234"/>
+          </w:tcPr>
+          <w:p>
+            <w:r/>
+            <w:r>
+              <w:t>0.5320</w:t>
+            </w:r>
+          </w:p>
+        </w:tc>
+        <w:tc>
+          <w:tcPr>
+            <w:tcW w:type="dxa" w:w="1234"/>
+          </w:tcPr>
+          <w:p>
+            <w:r/>
+            <w:r>
+              <w:t>64 min, Tesla T4</w:t>
+            </w:r>
+          </w:p>
+        </w:tc>
+      </w:tr>
+      <w:tr>
+        <w:tc>
+          <w:tcPr>
+            <w:tcW w:type="dxa" w:w="1234"/>
+          </w:tcPr>
+          <w:p>
+            <w:r/>
+            <w:r>
+              <w:t>EfficientNetV2-S</w:t>
+            </w:r>
+          </w:p>
+        </w:tc>
+        <w:tc>
+          <w:tcPr>
+            <w:tcW w:type="dxa" w:w="1234"/>
+          </w:tcPr>
+          <w:p>
+            <w:r/>
+            <w:r>
+              <w:t>ImageNet pretrained</w:t>
+            </w:r>
+          </w:p>
+        </w:tc>
+        <w:tc>
+          <w:tcPr>
+            <w:tcW w:type="dxa" w:w="1234"/>
+          </w:tcPr>
+          <w:p>
+            <w:r/>
+            <w:r>
+              <w:t>[PENDING]</w:t>
+            </w:r>
+          </w:p>
+        </w:tc>
+        <w:tc>
+          <w:tcPr>
+            <w:tcW w:type="dxa" w:w="1234"/>
+          </w:tcPr>
+          <w:p>
+            <w:r/>
+            <w:r>
+              <w:t>83.13 %</w:t>
+            </w:r>
+          </w:p>
+        </w:tc>
+        <w:tc>
+          <w:tcPr>
+            <w:tcW w:type="dxa" w:w="1234"/>
+          </w:tcPr>
+          <w:p>
+            <w:r/>
+            <w:r>
+              <w:t>97.75 %</w:t>
+            </w:r>
+          </w:p>
+        </w:tc>
+        <w:tc>
+          <w:tcPr>
+            <w:tcW w:type="dxa" w:w="1234"/>
+          </w:tcPr>
+          <w:p>
+            <w:r/>
+            <w:r>
+              <w:t>0.8254</w:t>
+            </w:r>
+          </w:p>
+        </w:tc>
+        <w:tc>
+          <w:tcPr>
+            <w:tcW w:type="dxa" w:w="1234"/>
+          </w:tcPr>
+          <w:p>
+            <w:r/>
+            <w:r>
+              <w:t>[PENDING]</w:t>
+            </w:r>
+          </w:p>
+        </w:tc>
+      </w:tr>
+      <w:tr>
+        <w:tc>
+          <w:tcPr>
+            <w:tcW w:type="dxa" w:w="1234"/>
+          </w:tcPr>
+          <w:p>
+            <w:r/>
+            <w:r>
+              <w:t>Swin-T</w:t>
+            </w:r>
+          </w:p>
+        </w:tc>
+        <w:tc>
+          <w:tcPr>
+            <w:tcW w:type="dxa" w:w="1234"/>
+          </w:tcPr>
+          <w:p>
+            <w:r/>
+            <w:r>
+              <w:t>ImageNet pretrained</w:t>
+            </w:r>
+          </w:p>
+        </w:tc>
+        <w:tc>
+          <w:tcPr>
+            <w:tcW w:type="dxa" w:w="1234"/>
+          </w:tcPr>
+          <w:p>
+            <w:r/>
+            <w:r>
+              <w:t>27,611,634</w:t>
+            </w:r>
+          </w:p>
+        </w:tc>
+        <w:tc>
+          <w:tcPr>
+            <w:tcW w:type="dxa" w:w="1234"/>
+          </w:tcPr>
+          <w:p>
+            <w:r/>
+            <w:r>
+              <w:t>85.38 %</w:t>
+            </w:r>
+          </w:p>
+        </w:tc>
+        <w:tc>
+          <w:tcPr>
+            <w:tcW w:type="dxa" w:w="1234"/>
+          </w:tcPr>
+          <w:p>
+            <w:r/>
+            <w:r>
+              <w:t>98.56 %</w:t>
+            </w:r>
+          </w:p>
+        </w:tc>
+        <w:tc>
+          <w:tcPr>
+            <w:tcW w:type="dxa" w:w="1234"/>
+          </w:tcPr>
+          <w:p>
+            <w:r/>
+            <w:r>
+              <w:t>0.8490</w:t>
+            </w:r>
+          </w:p>
+        </w:tc>
+        <w:tc>
+          <w:tcPr>
+            <w:tcW w:type="dxa" w:w="1234"/>
+          </w:tcPr>
+          <w:p>
+            <w:r/>
+            <w:r>
+              <w:t>19 min, RTX 4060</w:t>
+            </w:r>
+          </w:p>
+        </w:tc>
+      </w:tr>
+    </w:tbl>
+    <w:p/>
+    <w:p>
+      <w:r>
+        <w:t>All three models were trained on the same split, seed 42, 224 by 224 input, without label smoothing.</w:t>
+      </w:r>
+    </w:p>
+    <w:p>
+      <w:r>
+        <w:rPr>
+          <w:b/>
+        </w:rPr>
+        <w:t>The headline difference is approximately 29 to 32 percentage points of accuracy.</w:t>
+      </w:r>
+      <w:r>
+        <w:t xml:space="preserve"> The pretrained models reach 83 and 85 per cent where the from-scratch network reaches 54.</w:t>
+      </w:r>
+    </w:p>
+    <w:p>
+      <w:r>
+        <w:t>Two caveats belong with that number. First, the epoch budgets differ substantially: this model ran 59 of a 60 epoch budget and stopped early, whereas Swin-T reached its 15 epoch cap with its best epoch at 15, meaning it may not have converged and its figure is arguably a lower bound. Second, training times are not comparable across different GPUs and epoch counts, and are reported for transparency rather than as a benchmark.</w:t>
+      </w:r>
+    </w:p>
+    <w:p>
+      <w:r>
+        <w:rPr>
+          <w:b/>
+        </w:rPr>
+        <w:t>The clean test comparison is the more interesting column.</w:t>
+      </w:r>
+      <w:r>
+        <w:t xml:space="preserve"> Removing the 34 test photographs that have a confirmed duplicate in training moves the scores as follows:</w:t>
+      </w:r>
+    </w:p>
+    <w:tbl>
+      <w:tblPr>
+        <w:tblStyle w:val="LightGrid-Accent1"/>
+        <w:tblW w:type="auto" w:w="0"/>
+        <w:tblLook w:firstColumn="1" w:firstRow="1" w:lastColumn="0" w:lastRow="0" w:noHBand="0" w:noVBand="1" w:val="04A0"/>
+      </w:tblPr>
+      <w:tblGrid>
+        <w:gridCol w:w="2160"/>
+        <w:gridCol w:w="2160"/>
+        <w:gridCol w:w="2160"/>
+        <w:gridCol w:w="2160"/>
+      </w:tblGrid>
+      <w:tr>
+        <w:tc>
+          <w:tcPr>
+            <w:tcW w:type="dxa" w:w="2160"/>
+          </w:tcPr>
+          <w:p>
+            <w:r>
+              <w:rPr>
+                <w:b/>
+              </w:rPr>
+            </w:r>
+            <w:r>
+              <w:rPr>
+                <w:b/>
+              </w:rPr>
+              <w:t>Model</w:t>
+            </w:r>
+          </w:p>
+        </w:tc>
+        <w:tc>
+          <w:tcPr>
+            <w:tcW w:type="dxa" w:w="2160"/>
+          </w:tcPr>
+          <w:p>
+            <w:r>
+              <w:rPr>
+                <w:b/>
+              </w:rPr>
+            </w:r>
+            <w:r>
+              <w:rPr>
+                <w:b/>
+              </w:rPr>
+              <w:t>Full test (3,200)</w:t>
+            </w:r>
+          </w:p>
+        </w:tc>
+        <w:tc>
+          <w:tcPr>
+            <w:tcW w:type="dxa" w:w="2160"/>
+          </w:tcPr>
+          <w:p>
+            <w:r>
+              <w:rPr>
+                <w:b/>
+              </w:rPr>
+            </w:r>
+            <w:r>
+              <w:rPr>
+                <w:b/>
+              </w:rPr>
+              <w:t>Clean test (3,166)</w:t>
+            </w:r>
+          </w:p>
+        </w:tc>
+        <w:tc>
+          <w:tcPr>
+            <w:tcW w:type="dxa" w:w="2160"/>
+          </w:tcPr>
+          <w:p>
+            <w:r>
+              <w:rPr>
+                <w:b/>
+              </w:rPr>
+            </w:r>
+            <w:r>
+              <w:rPr>
+                <w:b/>
+              </w:rPr>
+              <w:t>Change</w:t>
+            </w:r>
+          </w:p>
+        </w:tc>
+      </w:tr>
+      <w:tr>
+        <w:tc>
+          <w:tcPr>
+            <w:tcW w:type="dxa" w:w="2160"/>
+          </w:tcPr>
+          <w:p>
+            <w:r/>
+            <w:r>
+              <w:t>Baseline CNN</w:t>
+            </w:r>
+          </w:p>
+        </w:tc>
+        <w:tc>
+          <w:tcPr>
+            <w:tcW w:type="dxa" w:w="2160"/>
+          </w:tcPr>
+          <w:p>
+            <w:r/>
+            <w:r>
+              <w:t>53.84 %</w:t>
+            </w:r>
+          </w:p>
+        </w:tc>
+        <w:tc>
+          <w:tcPr>
+            <w:tcW w:type="dxa" w:w="2160"/>
+          </w:tcPr>
+          <w:p>
+            <w:r/>
+            <w:r>
+              <w:t>53.63 %</w:t>
+            </w:r>
+          </w:p>
+        </w:tc>
+        <w:tc>
+          <w:tcPr>
+            <w:tcW w:type="dxa" w:w="2160"/>
+          </w:tcPr>
+          <w:p>
+            <w:r/>
+            <w:r>
+              <w:t>−0.21 points</w:t>
+            </w:r>
+          </w:p>
+        </w:tc>
+      </w:tr>
+      <w:tr>
+        <w:tc>
+          <w:tcPr>
+            <w:tcW w:type="dxa" w:w="2160"/>
+          </w:tcPr>
+          <w:p>
+            <w:r/>
+            <w:r>
+              <w:t>Swin-T</w:t>
+            </w:r>
+          </w:p>
+        </w:tc>
+        <w:tc>
+          <w:tcPr>
+            <w:tcW w:type="dxa" w:w="2160"/>
+          </w:tcPr>
+          <w:p>
+            <w:r/>
+            <w:r>
+              <w:t>85.38 %</w:t>
+            </w:r>
+          </w:p>
+        </w:tc>
+        <w:tc>
+          <w:tcPr>
+            <w:tcW w:type="dxa" w:w="2160"/>
+          </w:tcPr>
+          <w:p>
+            <w:r/>
+            <w:r>
+              <w:t>85.50 %</w:t>
+            </w:r>
+          </w:p>
+        </w:tc>
+        <w:tc>
+          <w:tcPr>
+            <w:tcW w:type="dxa" w:w="2160"/>
+          </w:tcPr>
+          <w:p>
+            <w:r/>
+            <w:r>
+              <w:t>+0.12 points</w:t>
+            </w:r>
+          </w:p>
+        </w:tc>
+      </w:tr>
+    </w:tbl>
+    <w:p/>
+    <w:p>
+      <w:r>
+        <w:t xml:space="preserve">Neither model moves meaningfully, and they move in opposite directions, which is what random variation on 34 photographs looks like. </w:t>
+      </w:r>
+      <w:r>
+        <w:rPr>
+          <w:b/>
+        </w:rPr>
+        <w:t>Duplicate photographs inside the dataset therefore explain none of the 30 point gap between the pretrained models and this one.</w:t>
+      </w:r>
+      <w:r>
+        <w:t xml:space="preserve"> That matters for the argument in section 5.4, because it eliminates the most obvious alternative explanation by measurement rather than by assertion.</w:t>
       </w:r>
     </w:p>
     <w:p/>
@@ -3981,12 +4595,65 @@
         <w:pStyle w:val="Heading2"/>
       </w:pPr>
       <w:r>
-        <w:t>5.4 Interpreting the comparison with pretrained models [PENDING once their figures exist]</w:t>
+        <w:t>5.4 Interpreting the comparison with pretrained models</w:t>
       </w:r>
     </w:p>
     <w:p>
       <w:r>
-        <w:t>The claim to make is narrow and defensible. Stanford Dogs is constructed from ImageNet, so models initialised with standard ImageNet pretrained weights have encountered the test photographs, with labels, during pretraining. The test partition is therefore not held out with respect to those models, and their reported accuracy measures something other than generalisation to unseen photographs.</w:t>
+        <w:t>The measured difference is large: 53.84 per cent from scratch against 83.13 and 85.38 per cent with ImageNet pretrained weights, a gap of roughly 29 to 32 percentage points on identical data, with the same split, seed and input size.</w:t>
+      </w:r>
+    </w:p>
+    <w:p>
+      <w:r>
+        <w:t>The claim to make about that gap is narrow and defensible. Stanford Dogs is constructed from ImageNet, so models initialised with standard ImageNet pretrained weights have encountered the test photographs, with labels, during pretraining. The test partition is therefore not held out with respect to those models, and their reported accuracy measures something other than generalisation to unseen photographs.</w:t>
+      </w:r>
+    </w:p>
+    <w:p>
+      <w:r>
+        <w:t>Two alternative explanations for the gap were considered and can be set aside:</w:t>
+      </w:r>
+    </w:p>
+    <w:p>
+      <w:pPr>
+        <w:pStyle w:val="ListNumber"/>
+      </w:pPr>
+      <w:r>
+        <w:rPr>
+          <w:b/>
+        </w:rPr>
+        <w:t>Duplicate photographs inside the dataset.</w:t>
+      </w:r>
+      <w:r>
+        <w:t xml:space="preserve"> Measured, and the effect is nil. Removing</w:t>
+      </w:r>
+    </w:p>
+    <w:p>
+      <w:r>
+        <w:t>the 34 affected test photographs changes this model by −0.21 points and Swin-T by +0.12, in opposite directions and within noise on a 34 photograph subset.</w:t>
+      </w:r>
+    </w:p>
+    <w:p>
+      <w:pPr>
+        <w:pStyle w:val="ListNumber"/>
+      </w:pPr>
+      <w:r>
+        <w:rPr>
+          <w:b/>
+        </w:rPr>
+        <w:t>Architecture alone.</w:t>
+      </w:r>
+      <w:r>
+        <w:t xml:space="preserve"> The pretrained models are larger, 6 and 27.6 million parameters</w:t>
+      </w:r>
+    </w:p>
+    <w:p>
+      <w:r>
+        <w:t>against 4.6 million, but iteration 2B showed that tripling this model's parameters bought 6.8 points of macro F1, not 30. Capacity is worth something; it is not worth the gap.</w:t>
+      </w:r>
+    </w:p>
+    <w:p>
+      <w:r>
+        <w:t>What remains is prior exposure to the data distribution, and for this dataset specifically, prior exposure to these very photographs.</w:t>
       </w:r>
     </w:p>
     <w:p>

</xml_diff>